<commit_message>
Creation of Milestone 4 project
</commit_message>
<xml_diff>
--- a/Milestone3/CST-250_Milestone3_ChadGalloway.docx
+++ b/Milestone3/CST-250_Milestone3_ChadGalloway.docx
@@ -90,19 +90,26 @@
           <w:sz w:val="46"/>
           <w:szCs w:val="46"/>
         </w:rPr>
-        <w:t>[Date]</w:t>
-      </w:r>
-    </w:p>
-    <w:p>
-      <w:pPr>
-        <w:jc w:val="center"/>
-      </w:pPr>
-      <w:r>
-        <w:rPr>
-          <w:sz w:val="46"/>
-          <w:szCs w:val="46"/>
-        </w:rPr>
-        <w:t>Milestone #</w:t>
+        <w:t>Nov. 09, 2025</w:t>
+      </w:r>
+    </w:p>
+    <w:p>
+      <w:pPr>
+        <w:jc w:val="center"/>
+      </w:pPr>
+      <w:r>
+        <w:rPr>
+          <w:sz w:val="46"/>
+          <w:szCs w:val="46"/>
+        </w:rPr>
+        <w:t xml:space="preserve">Milestone </w:t>
+      </w:r>
+      <w:r>
+        <w:rPr>
+          <w:sz w:val="46"/>
+          <w:szCs w:val="46"/>
+        </w:rPr>
+        <w:t>3</w:t>
       </w:r>
     </w:p>
     <w:p>
@@ -139,14 +146,27 @@
           <w:lang w:val="en-US"/>
         </w:rPr>
       </w:pPr>
-      <w:r>
+      <w:hyperlink r:id="rId5" w:history="1">
+        <w:r>
+          <w:rPr>
+            <w:rStyle w:val="Hyperlink"/>
+            <w:sz w:val="46"/>
+            <w:szCs w:val="46"/>
+            <w:lang w:val="en-US"/>
+          </w:rPr>
+          <w:t>https://github.com/CGalloway3/CST-250-Projects/tree/master/Milestone3</w:t>
+        </w:r>
+      </w:hyperlink>
+    </w:p>
+    <w:p>
+      <w:pPr>
+        <w:jc w:val="center"/>
         <w:rPr>
           <w:sz w:val="46"/>
           <w:szCs w:val="46"/>
           <w:lang w:val="en-US"/>
         </w:rPr>
-        <w:t>[Github Link]</w:t>
-      </w:r>
+      </w:pPr>
     </w:p>
     <w:p>
       <w:pPr>
@@ -157,22 +177,12 @@
           <w:lang w:val="en-US"/>
         </w:rPr>
       </w:pPr>
-    </w:p>
-    <w:p>
-      <w:pPr>
-        <w:jc w:val="center"/>
+      <w:r>
         <w:rPr>
           <w:sz w:val="46"/>
           <w:szCs w:val="46"/>
           <w:lang w:val="en-US"/>
         </w:rPr>
-      </w:pPr>
-      <w:r>
-        <w:rPr>
-          <w:sz w:val="46"/>
-          <w:szCs w:val="46"/>
-          <w:lang w:val="en-US"/>
-        </w:rPr>
         <w:t>Video</w:t>
       </w:r>
     </w:p>
@@ -184,22 +194,23 @@
           <w:szCs w:val="46"/>
         </w:rPr>
       </w:pPr>
-      <w:r>
-        <w:rPr>
-          <w:sz w:val="46"/>
-          <w:szCs w:val="46"/>
-        </w:rPr>
-        <w:t>[Video Link]</w:t>
-      </w:r>
-    </w:p>
-    <w:p>
-      <w:pPr>
-        <w:jc w:val="center"/>
-        <w:rPr>
-          <w:sz w:val="46"/>
-          <w:szCs w:val="46"/>
-        </w:rPr>
-      </w:pPr>
+      <w:hyperlink r:id="rId6" w:history="1">
+        <w:r>
+          <w:rPr>
+            <w:rStyle w:val="Hyperlink"/>
+            <w:sz w:val="46"/>
+            <w:szCs w:val="46"/>
+          </w:rPr>
+          <w:t>https://www.loom.com/share/8b1ac99b02a140b4a7d6ef4c050dcf95</w:t>
+        </w:r>
+      </w:hyperlink>
+      <w:r>
+        <w:rPr>
+          <w:sz w:val="46"/>
+          <w:szCs w:val="46"/>
+        </w:rPr>
+        <w:t xml:space="preserve"> </w:t>
+      </w:r>
     </w:p>
     <w:p/>
     <w:p/>
@@ -208,6 +219,7 @@
         <w:br w:type="page"/>
       </w:r>
     </w:p>
+    <w:p/>
     <w:p>
       <w:pPr>
         <w:jc w:val="center"/>
@@ -221,8 +233,7 @@
           <w:sz w:val="28"/>
           <w:szCs w:val="28"/>
         </w:rPr>
-        <w:lastRenderedPageBreak/>
-        <w:t>FLOW CHART</w:t>
+        <w:t>UML Class Diagram</w:t>
       </w:r>
     </w:p>
     <w:p>
@@ -243,21 +254,28 @@
           <w:noProof/>
         </w:rPr>
         <w:drawing>
-          <wp:inline distT="114300" distB="114300" distL="114300" distR="114300" wp14:anchorId="3BB06C81" wp14:editId="07777777">
-            <wp:extent cx="3148013" cy="1796373"/>
-            <wp:effectExtent l="0" t="0" r="0" b="0"/>
-            <wp:docPr id="1" name="image1.jpg"/>
-            <wp:cNvGraphicFramePr/>
+          <wp:inline distT="114300" distB="114300" distL="114300" distR="114300" wp14:anchorId="295F6FA6" wp14:editId="0C529D23">
+            <wp:extent cx="5943600" cy="5047488"/>
+            <wp:effectExtent l="0" t="0" r="0" b="1270"/>
+            <wp:docPr id="7" name="image1.jpg"/>
+            <wp:cNvGraphicFramePr>
+              <a:graphicFrameLocks xmlns:a="http://schemas.openxmlformats.org/drawingml/2006/main" noChangeAspect="1"/>
+            </wp:cNvGraphicFramePr>
             <a:graphic xmlns:a="http://schemas.openxmlformats.org/drawingml/2006/main">
               <a:graphicData uri="http://schemas.openxmlformats.org/drawingml/2006/picture">
                 <pic:pic xmlns:pic="http://schemas.openxmlformats.org/drawingml/2006/picture">
                   <pic:nvPicPr>
-                    <pic:cNvPr id="0" name="image1.jpg"/>
-                    <pic:cNvPicPr preferRelativeResize="0"/>
+                    <pic:cNvPr id="7" name="image1.jpg"/>
+                    <pic:cNvPicPr/>
                   </pic:nvPicPr>
                   <pic:blipFill>
-                    <a:blip r:embed="rId5"/>
-                    <a:srcRect/>
+                    <a:blip r:embed="rId7">
+                      <a:extLst>
+                        <a:ext uri="{28A0092B-C50C-407E-A947-70E740481C1C}">
+                          <a14:useLocalDpi xmlns:a14="http://schemas.microsoft.com/office/drawing/2010/main" val="0"/>
+                        </a:ext>
+                      </a:extLst>
+                    </a:blip>
                     <a:stretch>
                       <a:fillRect/>
                     </a:stretch>
@@ -265,7 +283,7 @@
                   <pic:spPr>
                     <a:xfrm>
                       <a:off x="0" y="0"/>
-                      <a:ext cx="3148013" cy="1796373"/>
+                      <a:ext cx="5943600" cy="5047488"/>
                     </a:xfrm>
                     <a:prstGeom prst="rect">
                       <a:avLst/>
@@ -284,28 +302,28 @@
         <w:jc w:val="center"/>
       </w:pPr>
       <w:r>
-        <w:t>Figure X: Flow chart of XXXXXXX</w:t>
-      </w:r>
-    </w:p>
-    <w:p>
-      <w:pPr>
-        <w:jc w:val="center"/>
-      </w:pPr>
-    </w:p>
-    <w:p>
-      <w:r>
-        <w:rPr>
-          <w:lang w:val="en-US"/>
-        </w:rPr>
-        <w:t>"Lorem ipsum dolor sit amet, consectetur adipiscing elit, sed do eiusmod tempor incididunt ut labore et dolore magna aliqua. Ut enim ad minim veniam, quis nostrud exercitation ullamco laboris nisi ut aliquip ex ea commodo consequat. Duis aute irure dolor in reprehenderit in voluptate velit esse cillum dolore eu fugiat nulla pariatur. Excepteur sint occaecat cupidatat non proident, sunt in culpa qui officia deserunt mollit anim id est laborum."</w:t>
-      </w:r>
+        <w:t xml:space="preserve">Figure </w:t>
+      </w:r>
+      <w:r>
+        <w:t>1</w:t>
+      </w:r>
+      <w:r>
+        <w:t>: UML Class Diagram</w:t>
+      </w:r>
+      <w:r>
+        <w:t xml:space="preserve"> with Milestone 3 changes</w:t>
+      </w:r>
+    </w:p>
+    <w:p>
+      <w:pPr>
+        <w:jc w:val="center"/>
+      </w:pPr>
     </w:p>
     <w:p>
       <w:r>
         <w:br w:type="page"/>
       </w:r>
     </w:p>
-    <w:p/>
     <w:p>
       <w:pPr>
         <w:jc w:val="center"/>
@@ -319,7 +337,8 @@
           <w:sz w:val="28"/>
           <w:szCs w:val="28"/>
         </w:rPr>
-        <w:t>UML Class Diagram</w:t>
+        <w:lastRenderedPageBreak/>
+        <w:t>Screen Shots</w:t>
       </w:r>
     </w:p>
     <w:p>
@@ -340,21 +359,28 @@
           <w:noProof/>
         </w:rPr>
         <w:drawing>
-          <wp:inline distT="114300" distB="114300" distL="114300" distR="114300" wp14:anchorId="295F6FA6" wp14:editId="07777777">
-            <wp:extent cx="3148013" cy="1796373"/>
+          <wp:inline distT="114300" distB="114300" distL="114300" distR="114300" wp14:anchorId="503F6C90" wp14:editId="0D0D1149">
+            <wp:extent cx="5943600" cy="5760720"/>
             <wp:effectExtent l="0" t="0" r="0" b="0"/>
-            <wp:docPr id="7" name="image1.jpg"/>
-            <wp:cNvGraphicFramePr/>
+            <wp:docPr id="5" name="image1.jpg"/>
+            <wp:cNvGraphicFramePr>
+              <a:graphicFrameLocks xmlns:a="http://schemas.openxmlformats.org/drawingml/2006/main" noChangeAspect="1"/>
+            </wp:cNvGraphicFramePr>
             <a:graphic xmlns:a="http://schemas.openxmlformats.org/drawingml/2006/main">
               <a:graphicData uri="http://schemas.openxmlformats.org/drawingml/2006/picture">
                 <pic:pic xmlns:pic="http://schemas.openxmlformats.org/drawingml/2006/picture">
                   <pic:nvPicPr>
-                    <pic:cNvPr id="0" name="image1.jpg"/>
-                    <pic:cNvPicPr preferRelativeResize="0"/>
+                    <pic:cNvPr id="5" name="image1.jpg"/>
+                    <pic:cNvPicPr/>
                   </pic:nvPicPr>
                   <pic:blipFill>
-                    <a:blip r:embed="rId5"/>
-                    <a:srcRect/>
+                    <a:blip r:embed="rId8">
+                      <a:extLst>
+                        <a:ext uri="{28A0092B-C50C-407E-A947-70E740481C1C}">
+                          <a14:useLocalDpi xmlns:a14="http://schemas.microsoft.com/office/drawing/2010/main" val="0"/>
+                        </a:ext>
+                      </a:extLst>
+                    </a:blip>
                     <a:stretch>
                       <a:fillRect/>
                     </a:stretch>
@@ -362,7 +388,7 @@
                   <pic:spPr>
                     <a:xfrm>
                       <a:off x="0" y="0"/>
-                      <a:ext cx="3148013" cy="1796373"/>
+                      <a:ext cx="5943600" cy="5760720"/>
                     </a:xfrm>
                     <a:prstGeom prst="rect">
                       <a:avLst/>
@@ -381,58 +407,28 @@
         <w:jc w:val="center"/>
       </w:pPr>
       <w:r>
-        <w:t>Figure X: UML Class Diagram</w:t>
-      </w:r>
-    </w:p>
-    <w:p>
-      <w:pPr>
-        <w:jc w:val="center"/>
-      </w:pPr>
-    </w:p>
-    <w:p>
-      <w:r>
-        <w:rPr>
-          <w:lang w:val="en-US"/>
-        </w:rPr>
-        <w:t xml:space="preserve">Lorem ipsum dolor sit amet, consectetur adipiscing elit, sed do eiusmod tempor incididunt ut labore et dolore magna aliqua. </w:t>
-      </w:r>
-      <w:r>
-        <w:rPr>
-          <w:lang w:val="pt-BR"/>
-        </w:rPr>
-        <w:t xml:space="preserve">Ut enim ad minim veniam, quis nostrud exercitation ullamco laboris nisi ut aliquip ex ea commodo consequat. </w:t>
-      </w:r>
-      <w:r>
-        <w:rPr>
-          <w:lang w:val="en-US"/>
-        </w:rPr>
-        <w:t>Duis aute irure dolor in reprehenderit in voluptate velit esse cillum dolore eu fugiat nulla pariatur. Excepteur sint occaecat cupidatat non proident, sunt in culpa qui officia deserunt mollit anim id est laborum.</w:t>
-      </w:r>
-    </w:p>
-    <w:p>
-      <w:r>
-        <w:br w:type="page"/>
-      </w:r>
+        <w:t xml:space="preserve">Figure </w:t>
+      </w:r>
+      <w:r>
+        <w:t>2</w:t>
+      </w:r>
+      <w:r>
+        <w:t xml:space="preserve">: Screenshot of </w:t>
+      </w:r>
+      <w:r>
+        <w:t>the initial loading state of the game after selecting 10 for board</w:t>
+      </w:r>
+      <w:r>
+        <w:t xml:space="preserve"> size and 1 for difficulty</w:t>
+      </w:r>
+    </w:p>
+    <w:p>
+      <w:pPr>
+        <w:jc w:val="center"/>
+      </w:pPr>
     </w:p>
     <w:p/>
-    <w:p>
-      <w:pPr>
-        <w:jc w:val="center"/>
-        <w:rPr>
-          <w:b/>
-          <w:sz w:val="28"/>
-          <w:szCs w:val="28"/>
-        </w:rPr>
-      </w:pPr>
-      <w:r>
-        <w:rPr>
-          <w:b/>
-          <w:sz w:val="28"/>
-          <w:szCs w:val="28"/>
-        </w:rPr>
-        <w:t>Low Fidelity</w:t>
-      </w:r>
-    </w:p>
+    <w:p/>
     <w:p>
       <w:pPr>
         <w:jc w:val="center"/>
@@ -441,22 +437,30 @@
         <w:rPr>
           <w:noProof/>
         </w:rPr>
+        <w:lastRenderedPageBreak/>
         <w:drawing>
-          <wp:inline distT="114300" distB="114300" distL="114300" distR="114300" wp14:anchorId="31DD3869" wp14:editId="07777777">
-            <wp:extent cx="3148013" cy="1796373"/>
+          <wp:inline distT="114300" distB="114300" distL="114300" distR="114300" wp14:anchorId="77CED477" wp14:editId="6896CA6E">
+            <wp:extent cx="5943600" cy="6711696"/>
             <wp:effectExtent l="0" t="0" r="0" b="0"/>
-            <wp:docPr id="4" name="image1.jpg"/>
-            <wp:cNvGraphicFramePr/>
+            <wp:docPr id="6" name="image1.jpg"/>
+            <wp:cNvGraphicFramePr>
+              <a:graphicFrameLocks xmlns:a="http://schemas.openxmlformats.org/drawingml/2006/main" noChangeAspect="1"/>
+            </wp:cNvGraphicFramePr>
             <a:graphic xmlns:a="http://schemas.openxmlformats.org/drawingml/2006/main">
               <a:graphicData uri="http://schemas.openxmlformats.org/drawingml/2006/picture">
                 <pic:pic xmlns:pic="http://schemas.openxmlformats.org/drawingml/2006/picture">
                   <pic:nvPicPr>
-                    <pic:cNvPr id="0" name="image1.jpg"/>
-                    <pic:cNvPicPr preferRelativeResize="0"/>
+                    <pic:cNvPr id="6" name="image1.jpg"/>
+                    <pic:cNvPicPr/>
                   </pic:nvPicPr>
                   <pic:blipFill>
-                    <a:blip r:embed="rId5"/>
-                    <a:srcRect/>
+                    <a:blip r:embed="rId9">
+                      <a:extLst>
+                        <a:ext uri="{28A0092B-C50C-407E-A947-70E740481C1C}">
+                          <a14:useLocalDpi xmlns:a14="http://schemas.microsoft.com/office/drawing/2010/main" val="0"/>
+                        </a:ext>
+                      </a:extLst>
+                    </a:blip>
                     <a:stretch>
                       <a:fillRect/>
                     </a:stretch>
@@ -464,7 +468,7 @@
                   <pic:spPr>
                     <a:xfrm>
                       <a:off x="0" y="0"/>
-                      <a:ext cx="3148013" cy="1796373"/>
+                      <a:ext cx="5943600" cy="6711696"/>
                     </a:xfrm>
                     <a:prstGeom prst="rect">
                       <a:avLst/>
@@ -483,37 +487,28 @@
         <w:jc w:val="center"/>
       </w:pPr>
       <w:r>
-        <w:t>Figure X: Low Fidelity</w:t>
-      </w:r>
-    </w:p>
-    <w:p>
-      <w:pPr>
-        <w:jc w:val="center"/>
-      </w:pPr>
-    </w:p>
-    <w:p>
-      <w:r>
-        <w:rPr>
-          <w:lang w:val="en-US"/>
-        </w:rPr>
-        <w:t xml:space="preserve">Lorem ipsum dolor sit amet, consectetur adipiscing elit, sed do eiusmod tempor incididunt ut labore et dolore magna aliqua. </w:t>
-      </w:r>
-      <w:r>
-        <w:rPr>
-          <w:lang w:val="pt-BR"/>
-        </w:rPr>
-        <w:t xml:space="preserve">Ut enim ad minim veniam, quis nostrud exercitation ullamco laboris nisi ut aliquip ex ea commodo consequat. </w:t>
-      </w:r>
-      <w:r>
-        <w:rPr>
-          <w:lang w:val="en-US"/>
-        </w:rPr>
-        <w:t>Duis aute irure dolor in reprehenderit in voluptate velit esse cillum dolore eu fugiat nulla pariatur. Excepteur sint occaecat cupidatat non proident, sunt in culpa qui officia deserunt mollit anim id est laborum.</w:t>
-      </w:r>
-    </w:p>
-    <w:p>
-      <w:r>
-        <w:br w:type="page"/>
+        <w:t xml:space="preserve">Figure </w:t>
+      </w:r>
+      <w:r>
+        <w:t>3</w:t>
+      </w:r>
+      <w:r>
+        <w:t xml:space="preserve">: Screenshot of </w:t>
+      </w:r>
+      <w:r>
+        <w:t>flo</w:t>
+      </w:r>
+      <w:r>
+        <w:t>o</w:t>
+      </w:r>
+      <w:r>
+        <w:t>d fill of an area after selecting</w:t>
+      </w:r>
+      <w:r>
+        <w:t xml:space="preserve"> 6, 6 to visit. The reward was still collected even if the user did not click directly on it</w:t>
+      </w:r>
+      <w:r>
+        <w:t>.</w:t>
       </w:r>
     </w:p>
     <w:p/>
@@ -526,37 +521,54 @@
         </w:rPr>
       </w:pPr>
       <w:r>
+        <w:br w:type="page"/>
+      </w:r>
+      <w:r>
         <w:rPr>
           <w:sz w:val="28"/>
           <w:szCs w:val="28"/>
         </w:rPr>
-        <w:t>High Fidelity</w:t>
-      </w:r>
-    </w:p>
-    <w:p>
-      <w:pPr>
-        <w:jc w:val="center"/>
-      </w:pPr>
+        <w:lastRenderedPageBreak/>
+        <w:t>Code Changes</w:t>
+      </w:r>
+    </w:p>
+    <w:p>
+      <w:pPr>
+        <w:jc w:val="center"/>
+        <w:rPr>
+          <w:sz w:val="28"/>
+          <w:szCs w:val="28"/>
+        </w:rPr>
+      </w:pPr>
+    </w:p>
+    <w:p>
       <w:r>
         <w:rPr>
           <w:noProof/>
         </w:rPr>
         <w:drawing>
-          <wp:inline distT="114300" distB="114300" distL="114300" distR="114300" wp14:anchorId="160A7949" wp14:editId="07777777">
-            <wp:extent cx="3148013" cy="1796373"/>
-            <wp:effectExtent l="0" t="0" r="0" b="0"/>
-            <wp:docPr id="3" name="image1.jpg"/>
-            <wp:cNvGraphicFramePr/>
+          <wp:inline distT="0" distB="0" distL="0" distR="0" wp14:anchorId="7913B616" wp14:editId="36404543">
+            <wp:extent cx="5941554" cy="3319272"/>
+            <wp:effectExtent l="0" t="0" r="2540" b="0"/>
+            <wp:docPr id="981959606" name="Picture 1"/>
+            <wp:cNvGraphicFramePr>
+              <a:graphicFrameLocks xmlns:a="http://schemas.openxmlformats.org/drawingml/2006/main" noChangeAspect="1"/>
+            </wp:cNvGraphicFramePr>
             <a:graphic xmlns:a="http://schemas.openxmlformats.org/drawingml/2006/main">
               <a:graphicData uri="http://schemas.openxmlformats.org/drawingml/2006/picture">
                 <pic:pic xmlns:pic="http://schemas.openxmlformats.org/drawingml/2006/picture">
                   <pic:nvPicPr>
-                    <pic:cNvPr id="0" name="image1.jpg"/>
-                    <pic:cNvPicPr preferRelativeResize="0"/>
+                    <pic:cNvPr id="981959606" name="Picture 981959606"/>
+                    <pic:cNvPicPr/>
                   </pic:nvPicPr>
                   <pic:blipFill>
-                    <a:blip r:embed="rId5"/>
-                    <a:srcRect/>
+                    <a:blip r:embed="rId10" cstate="print">
+                      <a:extLst>
+                        <a:ext uri="{28A0092B-C50C-407E-A947-70E740481C1C}">
+                          <a14:useLocalDpi xmlns:a14="http://schemas.microsoft.com/office/drawing/2010/main" val="0"/>
+                        </a:ext>
+                      </a:extLst>
+                    </a:blip>
                     <a:stretch>
                       <a:fillRect/>
                     </a:stretch>
@@ -564,12 +576,11 @@
                   <pic:spPr>
                     <a:xfrm>
                       <a:off x="0" y="0"/>
-                      <a:ext cx="3148013" cy="1796373"/>
+                      <a:ext cx="5941554" cy="3319272"/>
                     </a:xfrm>
                     <a:prstGeom prst="rect">
                       <a:avLst/>
                     </a:prstGeom>
-                    <a:ln/>
                   </pic:spPr>
                 </pic:pic>
               </a:graphicData>
@@ -583,89 +594,48 @@
         <w:jc w:val="center"/>
       </w:pPr>
       <w:r>
-        <w:t>Figure X: High Fidelity</w:t>
-      </w:r>
-    </w:p>
-    <w:p>
-      <w:pPr>
-        <w:jc w:val="center"/>
-      </w:pPr>
-    </w:p>
-    <w:p>
-      <w:r>
-        <w:rPr>
-          <w:lang w:val="en-US"/>
-        </w:rPr>
-        <w:t xml:space="preserve">Lorem ipsum dolor sit amet, consectetur adipiscing elit, sed do eiusmod tempor incididunt ut labore et dolore magna aliqua. </w:t>
-      </w:r>
-      <w:r>
-        <w:rPr>
-          <w:lang w:val="pt-BR"/>
-        </w:rPr>
-        <w:t xml:space="preserve">Ut enim ad minim veniam, quis nostrud exercitation ullamco laboris nisi ut aliquip ex ea commodo consequat. </w:t>
-      </w:r>
-      <w:r>
-        <w:rPr>
-          <w:lang w:val="en-US"/>
-        </w:rPr>
-        <w:t>Duis aute irure dolor in reprehenderit in voluptate velit esse cillum dolore eu fugiat nulla pariatur. Excepteur sint occaecat cupidatat non proident, sunt in culpa qui officia deserunt mollit anim id est laborum.</w:t>
-      </w:r>
-    </w:p>
-    <w:p>
-      <w:r>
-        <w:br w:type="page"/>
-      </w:r>
-    </w:p>
-    <w:p/>
-    <w:p>
-      <w:pPr>
-        <w:jc w:val="center"/>
-        <w:rPr>
-          <w:sz w:val="28"/>
-          <w:szCs w:val="28"/>
-        </w:rPr>
-      </w:pPr>
-      <w:r>
-        <w:rPr>
-          <w:sz w:val="28"/>
-          <w:szCs w:val="28"/>
-        </w:rPr>
-        <w:t>Screen Shots</w:t>
-      </w:r>
-    </w:p>
-    <w:p>
-      <w:pPr>
-        <w:jc w:val="center"/>
-        <w:rPr>
-          <w:sz w:val="28"/>
-          <w:szCs w:val="28"/>
-        </w:rPr>
-      </w:pPr>
-    </w:p>
-    <w:p>
-      <w:pPr>
-        <w:jc w:val="center"/>
-      </w:pPr>
+        <w:t xml:space="preserve">Figure 4: Screenshot of flood fill </w:t>
+      </w:r>
+      <w:r>
+        <w:t>code addition</w:t>
+      </w:r>
+      <w:r>
+        <w:t>.</w:t>
+      </w:r>
+    </w:p>
+    <w:p>
+      <w:pPr>
+        <w:jc w:val="center"/>
+      </w:pPr>
+    </w:p>
+    <w:p>
       <w:r>
         <w:rPr>
           <w:noProof/>
         </w:rPr>
         <w:drawing>
-          <wp:inline distT="114300" distB="114300" distL="114300" distR="114300" wp14:anchorId="503F6C90" wp14:editId="07777777">
-            <wp:extent cx="3148013" cy="1796373"/>
-            <wp:effectExtent l="0" t="0" r="0" b="0"/>
-            <wp:docPr id="5" name="image1.jpg"/>
-            <wp:cNvGraphicFramePr/>
+          <wp:inline distT="0" distB="0" distL="0" distR="0" wp14:anchorId="030FB9F6" wp14:editId="0D5DC89E">
+            <wp:extent cx="5941554" cy="3319272"/>
+            <wp:effectExtent l="0" t="0" r="2540" b="0"/>
+            <wp:docPr id="537889182" name="Picture 1"/>
+            <wp:cNvGraphicFramePr>
+              <a:graphicFrameLocks xmlns:a="http://schemas.openxmlformats.org/drawingml/2006/main" noChangeAspect="1"/>
+            </wp:cNvGraphicFramePr>
             <a:graphic xmlns:a="http://schemas.openxmlformats.org/drawingml/2006/main">
               <a:graphicData uri="http://schemas.openxmlformats.org/drawingml/2006/picture">
                 <pic:pic xmlns:pic="http://schemas.openxmlformats.org/drawingml/2006/picture">
                   <pic:nvPicPr>
-                    <pic:cNvPr id="0" name="image1.jpg"/>
-                    <pic:cNvPicPr preferRelativeResize="0"/>
+                    <pic:cNvPr id="981959606" name="Picture 981959606"/>
+                    <pic:cNvPicPr/>
                   </pic:nvPicPr>
                   <pic:blipFill>
-                    <a:blip r:embed="rId5"/>
-                    <a:srcRect/>
+                    <a:blip r:embed="rId10" cstate="print">
+                      <a:extLst>
+                        <a:ext uri="{28A0092B-C50C-407E-A947-70E740481C1C}">
+                          <a14:useLocalDpi xmlns:a14="http://schemas.microsoft.com/office/drawing/2010/main" val="0"/>
+                        </a:ext>
+                      </a:extLst>
+                    </a:blip>
                     <a:stretch>
                       <a:fillRect/>
                     </a:stretch>
@@ -673,12 +643,11 @@
                   <pic:spPr>
                     <a:xfrm>
                       <a:off x="0" y="0"/>
-                      <a:ext cx="3148013" cy="1796373"/>
+                      <a:ext cx="5941554" cy="3319272"/>
                     </a:xfrm>
                     <a:prstGeom prst="rect">
                       <a:avLst/>
                     </a:prstGeom>
-                    <a:ln/>
                   </pic:spPr>
                 </pic:pic>
               </a:graphicData>
@@ -692,95 +661,61 @@
         <w:jc w:val="center"/>
       </w:pPr>
       <w:r>
-        <w:t>Figure X: Screenshot of successful output</w:t>
-      </w:r>
-    </w:p>
-    <w:p>
-      <w:pPr>
-        <w:jc w:val="center"/>
-      </w:pPr>
-    </w:p>
-    <w:p>
-      <w:r>
-        <w:rPr>
-          <w:lang w:val="en-US"/>
-        </w:rPr>
-        <w:t>Lorem ipsum dolor sit amet, consectetur adipiscing elit, sed do eiusmod tempor incididunt ut labore et dolore magna aliqua. Ut enim ad minim veniam, quis nostrud exercitation ullamco laboris nisi ut aliquip ex ea commodo consequat. Duis aute irure dolor in reprehenderit in voluptate velit esse cillum dolore eu fugiat nulla pariatur. Excepteur sint occaecat cupidatat non proident, sunt in culpa qui officia deserunt mollit anim id est laborum.</w:t>
-      </w:r>
-    </w:p>
-    <w:p/>
-    <w:p/>
-    <w:p>
-      <w:pPr>
-        <w:jc w:val="center"/>
-      </w:pPr>
-      <w:r>
-        <w:rPr>
-          <w:noProof/>
-        </w:rPr>
-        <w:drawing>
-          <wp:inline distT="114300" distB="114300" distL="114300" distR="114300" wp14:anchorId="77CED477" wp14:editId="07777777">
-            <wp:extent cx="3148013" cy="1796373"/>
-            <wp:effectExtent l="0" t="0" r="0" b="0"/>
-            <wp:docPr id="6" name="image1.jpg"/>
-            <wp:cNvGraphicFramePr/>
-            <a:graphic xmlns:a="http://schemas.openxmlformats.org/drawingml/2006/main">
-              <a:graphicData uri="http://schemas.openxmlformats.org/drawingml/2006/picture">
-                <pic:pic xmlns:pic="http://schemas.openxmlformats.org/drawingml/2006/picture">
-                  <pic:nvPicPr>
-                    <pic:cNvPr id="0" name="image1.jpg"/>
-                    <pic:cNvPicPr preferRelativeResize="0"/>
-                  </pic:nvPicPr>
-                  <pic:blipFill>
-                    <a:blip r:embed="rId5"/>
-                    <a:srcRect/>
-                    <a:stretch>
-                      <a:fillRect/>
-                    </a:stretch>
-                  </pic:blipFill>
-                  <pic:spPr>
-                    <a:xfrm>
-                      <a:off x="0" y="0"/>
-                      <a:ext cx="3148013" cy="1796373"/>
-                    </a:xfrm>
-                    <a:prstGeom prst="rect">
-                      <a:avLst/>
-                    </a:prstGeom>
-                    <a:ln/>
-                  </pic:spPr>
-                </pic:pic>
-              </a:graphicData>
-            </a:graphic>
-          </wp:inline>
-        </w:drawing>
-      </w:r>
-    </w:p>
-    <w:p>
-      <w:pPr>
-        <w:jc w:val="center"/>
-      </w:pPr>
-      <w:r>
-        <w:t>Figure X: Screenshot of Error Handling</w:t>
-      </w:r>
-    </w:p>
-    <w:p>
-      <w:pPr>
-        <w:jc w:val="center"/>
-      </w:pPr>
-    </w:p>
-    <w:p>
-      <w:r>
-        <w:rPr>
-          <w:lang w:val="en-US"/>
-        </w:rPr>
-        <w:t>Lorem ipsum dolor sit amet, consectetur adipiscing elit, sed do eiusmod tempor incididunt ut labore et dolore magna aliqua. Ut enim ad minim veniam, quis nostrud exercitation ullamco laboris nisi ut aliquip ex ea commodo consequat. Duis aute irure dolor in reprehenderit in voluptate velit esse cillum dolore eu fugiat nulla pariatur. Excepteur sint occaecat cupidatat non proident, sunt in culpa qui officia deserunt mollit anim id est laborum.</w:t>
-      </w:r>
-    </w:p>
-    <w:p/>
-    <w:p>
-      <w:r>
-        <w:br w:type="page"/>
-      </w:r>
+        <w:t xml:space="preserve">Figure 5: Screenshot of </w:t>
+      </w:r>
+      <w:proofErr w:type="spellStart"/>
+      <w:r>
+        <w:t>ClaimRewards</w:t>
+      </w:r>
+      <w:proofErr w:type="spellEnd"/>
+      <w:r>
+        <w:t>() method all rewards were handled in the determine game state method but I moved it to the flood fill and into its own</w:t>
+      </w:r>
+      <w:r>
+        <w:t xml:space="preserve"> method </w:t>
+      </w:r>
+      <w:r>
+        <w:t>because</w:t>
+      </w:r>
+      <w:r>
+        <w:t xml:space="preserve"> it needed to be called </w:t>
+      </w:r>
+      <w:r>
+        <w:t>from two different</w:t>
+      </w:r>
+      <w:r>
+        <w:t xml:space="preserve"> locations to function properly. </w:t>
+      </w:r>
+      <w:r>
+        <w:t>Ideally,</w:t>
+      </w:r>
+      <w:r>
+        <w:t xml:space="preserve"> I would like to move it to an </w:t>
+      </w:r>
+      <w:r>
+        <w:lastRenderedPageBreak/>
+        <w:t xml:space="preserve">event and add a listener but I need to do more research on that. I </w:t>
+      </w:r>
+      <w:r>
+        <w:t>fully</w:t>
+      </w:r>
+      <w:r>
+        <w:t xml:space="preserve"> understand the concept of events and listeners but I am foggy on the implementation so hopefully next week I can have it in</w:t>
+      </w:r>
+      <w:r>
+        <w:t xml:space="preserve"> to remove the </w:t>
+      </w:r>
+      <w:r>
+        <w:t>overhead</w:t>
+      </w:r>
+      <w:r>
+        <w:t xml:space="preserve"> in the flood fill.</w:t>
+      </w:r>
+    </w:p>
+    <w:p>
+      <w:pPr>
+        <w:jc w:val="center"/>
+      </w:pPr>
     </w:p>
     <w:p>
       <w:pPr>
@@ -790,700 +725,59 @@
           <w:szCs w:val="28"/>
         </w:rPr>
       </w:pPr>
-      <w:r>
+    </w:p>
+    <w:p>
+      <w:pPr>
+        <w:jc w:val="center"/>
         <w:rPr>
           <w:sz w:val="28"/>
           <w:szCs w:val="28"/>
         </w:rPr>
-        <w:lastRenderedPageBreak/>
-        <w:t>Use Case Scenario</w:t>
-      </w:r>
-    </w:p>
-    <w:p>
-      <w:pPr>
-        <w:jc w:val="center"/>
-      </w:pPr>
-      <w:r>
-        <w:rPr>
-          <w:noProof/>
-        </w:rPr>
-        <w:drawing>
-          <wp:inline distT="114300" distB="114300" distL="114300" distR="114300" wp14:anchorId="1853F1F2" wp14:editId="07777777">
-            <wp:extent cx="3148013" cy="1796373"/>
-            <wp:effectExtent l="0" t="0" r="0" b="0"/>
-            <wp:docPr id="2" name="image1.jpg"/>
-            <wp:cNvGraphicFramePr/>
-            <a:graphic xmlns:a="http://schemas.openxmlformats.org/drawingml/2006/main">
-              <a:graphicData uri="http://schemas.openxmlformats.org/drawingml/2006/picture">
-                <pic:pic xmlns:pic="http://schemas.openxmlformats.org/drawingml/2006/picture">
-                  <pic:nvPicPr>
-                    <pic:cNvPr id="0" name="image1.jpg"/>
-                    <pic:cNvPicPr preferRelativeResize="0"/>
-                  </pic:nvPicPr>
-                  <pic:blipFill>
-                    <a:blip r:embed="rId5"/>
-                    <a:srcRect/>
-                    <a:stretch>
-                      <a:fillRect/>
-                    </a:stretch>
-                  </pic:blipFill>
-                  <pic:spPr>
-                    <a:xfrm>
-                      <a:off x="0" y="0"/>
-                      <a:ext cx="3148013" cy="1796373"/>
-                    </a:xfrm>
-                    <a:prstGeom prst="rect">
-                      <a:avLst/>
-                    </a:prstGeom>
-                    <a:ln/>
-                  </pic:spPr>
-                </pic:pic>
-              </a:graphicData>
-            </a:graphic>
-          </wp:inline>
-        </w:drawing>
-      </w:r>
-    </w:p>
-    <w:p>
-      <w:pPr>
-        <w:jc w:val="center"/>
-      </w:pPr>
-      <w:r>
-        <w:t>Figure X: Use Case</w:t>
-      </w:r>
-    </w:p>
-    <w:p>
-      <w:pPr>
-        <w:jc w:val="center"/>
-      </w:pPr>
-    </w:p>
-    <w:p>
-      <w:r>
-        <w:rPr>
-          <w:lang w:val="en-US"/>
-        </w:rPr>
-        <w:t xml:space="preserve">Lorem ipsum dolor sit amet, consectetur adipiscing elit, sed do eiusmod tempor incididunt ut labore et dolore magna aliqua. </w:t>
-      </w:r>
-      <w:r>
-        <w:rPr>
-          <w:lang w:val="pt-BR"/>
-        </w:rPr>
-        <w:t xml:space="preserve">Ut enim ad minim veniam, quis nostrud exercitation ullamco laboris nisi ut aliquip ex ea commodo consequat. </w:t>
-      </w:r>
-      <w:r>
-        <w:rPr>
-          <w:lang w:val="en-US"/>
-        </w:rPr>
-        <w:t>Duis aute irure dolor in reprehenderit in voluptate velit esse cillum dolore eu fugiat nulla pariatur. Excepteur sint occaecat cupidatat non proident, sunt in culpa qui officia deserunt mollit anim id est laborum.</w:t>
-      </w:r>
-    </w:p>
-    <w:p/>
-    <w:p>
-      <w:pPr>
-        <w:jc w:val="center"/>
+      </w:pPr>
+      <w:r>
         <w:rPr>
           <w:sz w:val="28"/>
           <w:szCs w:val="28"/>
         </w:rPr>
-      </w:pPr>
-      <w:r>
-        <w:br w:type="page"/>
-      </w:r>
-    </w:p>
-    <w:p>
-      <w:pPr>
-        <w:jc w:val="center"/>
+        <w:t>S</w:t>
+      </w:r>
+      <w:r>
         <w:rPr>
           <w:sz w:val="28"/>
           <w:szCs w:val="28"/>
         </w:rPr>
-      </w:pPr>
-      <w:r>
+        <w:t>ummary of Concepts</w:t>
+      </w:r>
+    </w:p>
+    <w:p>
+      <w:pPr>
+        <w:jc w:val="center"/>
         <w:rPr>
           <w:sz w:val="28"/>
           <w:szCs w:val="28"/>
         </w:rPr>
-        <w:lastRenderedPageBreak/>
-        <w:t>ADD ON</w:t>
-      </w:r>
-    </w:p>
-    <w:p>
-      <w:pPr>
-        <w:jc w:val="center"/>
-        <w:rPr>
-          <w:sz w:val="28"/>
-          <w:szCs w:val="28"/>
-        </w:rPr>
-      </w:pPr>
-      <w:r>
-        <w:rPr>
-          <w:sz w:val="28"/>
-          <w:szCs w:val="28"/>
-        </w:rPr>
-        <w:t>Programming Conventions</w:t>
-      </w:r>
-    </w:p>
-    <w:p>
-      <w:r>
-        <w:t>X. Programing Convention 1</w:t>
-      </w:r>
-    </w:p>
-    <w:p>
-      <w:r>
-        <w:t>X. Programing Convention 2</w:t>
-      </w:r>
-    </w:p>
-    <w:p>
-      <w:r>
-        <w:t>X. Programing Convention 3</w:t>
-      </w:r>
-    </w:p>
-    <w:p>
-      <w:pPr>
-        <w:rPr>
-          <w:sz w:val="28"/>
-          <w:szCs w:val="28"/>
-        </w:rPr>
-      </w:pPr>
-    </w:p>
-    <w:p>
-      <w:pPr>
-        <w:jc w:val="center"/>
-        <w:rPr>
-          <w:sz w:val="28"/>
-          <w:szCs w:val="28"/>
-        </w:rPr>
-      </w:pPr>
-      <w:r>
-        <w:rPr>
-          <w:sz w:val="28"/>
-          <w:szCs w:val="28"/>
-        </w:rPr>
-        <w:t>Computer Specs</w:t>
-      </w:r>
-    </w:p>
-    <w:p>
-      <w:r>
-        <w:t>X. Spec X</w:t>
-      </w:r>
-    </w:p>
-    <w:p>
-      <w:r>
-        <w:t>X. Spec X</w:t>
-      </w:r>
-    </w:p>
-    <w:p>
-      <w:r>
-        <w:t>X. Spec X</w:t>
-      </w:r>
-    </w:p>
-    <w:p>
-      <w:r>
-        <w:t>X. Spec X</w:t>
-      </w:r>
-    </w:p>
-    <w:p>
-      <w:r>
-        <w:t>X. Spec X</w:t>
-      </w:r>
-    </w:p>
-    <w:p>
-      <w:pPr>
-        <w:rPr>
-          <w:sz w:val="28"/>
-          <w:szCs w:val="28"/>
-        </w:rPr>
-      </w:pPr>
-    </w:p>
-    <w:p>
-      <w:pPr>
-        <w:jc w:val="center"/>
-        <w:rPr>
-          <w:sz w:val="28"/>
-          <w:szCs w:val="28"/>
-        </w:rPr>
-      </w:pPr>
-      <w:r>
-        <w:rPr>
-          <w:sz w:val="28"/>
-          <w:szCs w:val="28"/>
-        </w:rPr>
-        <w:t>Tutor Discovery</w:t>
-      </w:r>
-    </w:p>
-    <w:p>
-      <w:r>
-        <w:t>tutor 1 name:</w:t>
-      </w:r>
-    </w:p>
-    <w:p>
-      <w:r>
-        <w:t>tutor 1 email:</w:t>
-      </w:r>
-    </w:p>
-    <w:p>
-      <w:r>
-        <w:t>tutor 1 schedule:</w:t>
-      </w:r>
-    </w:p>
-    <w:p>
-      <w:r>
-        <w:t>tutor 1: company/institution:</w:t>
-      </w:r>
-    </w:p>
-    <w:p/>
-    <w:p>
-      <w:r>
-        <w:t>tutor 2 name:</w:t>
-      </w:r>
-    </w:p>
-    <w:p>
-      <w:r>
-        <w:t>tutor 2 email:</w:t>
-      </w:r>
-    </w:p>
-    <w:p>
-      <w:r>
-        <w:t>tutor 2 schedule:</w:t>
-      </w:r>
-    </w:p>
-    <w:p>
-      <w:r>
-        <w:t>tutor 2: company/institution:</w:t>
-      </w:r>
-    </w:p>
-    <w:p/>
-    <w:p>
-      <w:pPr>
-        <w:jc w:val="center"/>
-        <w:rPr>
-          <w:b/>
-          <w:sz w:val="28"/>
-          <w:szCs w:val="28"/>
-        </w:rPr>
-      </w:pPr>
-      <w:r>
-        <w:rPr>
-          <w:b/>
-          <w:sz w:val="28"/>
-          <w:szCs w:val="28"/>
-        </w:rPr>
-        <w:t>Weekly Activity</w:t>
-      </w:r>
-    </w:p>
-    <w:p>
-      <w:r>
-        <w:t>Monday</w:t>
-      </w:r>
-    </w:p>
-    <w:p>
-      <w:r>
-        <w:rPr>
-          <w:lang w:val="en-US"/>
-        </w:rPr>
-        <w:t>Start: 99:99 End: 99:99 Activity:Lorem ipsum dolor sit amet</w:t>
-      </w:r>
-    </w:p>
-    <w:p>
-      <w:r>
-        <w:rPr>
-          <w:lang w:val="en-US"/>
-        </w:rPr>
-        <w:t>Start: 9:99 End:9:99  Activity: Excepteur sint occaecat cupidatat non proident</w:t>
-      </w:r>
-    </w:p>
-    <w:p>
-      <w:r>
-        <w:rPr>
-          <w:lang w:val="en-US"/>
-        </w:rPr>
-        <w:t>Start: 9:99 End:9:99  Activity: Duis aute irure dolor in reprehenderit in voluptate</w:t>
-      </w:r>
-    </w:p>
-    <w:p>
-      <w:r>
-        <w:t>Tuesday</w:t>
-      </w:r>
-    </w:p>
-    <w:p>
-      <w:r>
-        <w:rPr>
-          <w:lang w:val="en-US"/>
-        </w:rPr>
-        <w:t>Start: 9:99 End:9:99  Activity: Excepteur sint occaecat cupidatat non proident</w:t>
-      </w:r>
-    </w:p>
-    <w:p>
-      <w:r>
-        <w:rPr>
-          <w:lang w:val="en-US"/>
-        </w:rPr>
-        <w:t>Start: 9:99 End: 9:99 Activity: Duis aute irure dolor in reprehenderit in voluptate</w:t>
-      </w:r>
-    </w:p>
-    <w:p>
-      <w:r>
-        <w:t>Wednesday</w:t>
-      </w:r>
-    </w:p>
-    <w:p>
-      <w:r>
-        <w:rPr>
-          <w:lang w:val="en-US"/>
-        </w:rPr>
-        <w:t>Start: 9:99 End: 9:99 Activity: Lorem ipsum dolor sit amet</w:t>
-      </w:r>
-    </w:p>
-    <w:p/>
-    <w:p/>
-    <w:p>
-      <w:pPr>
-        <w:jc w:val="center"/>
-        <w:rPr>
-          <w:b/>
-        </w:rPr>
-      </w:pPr>
-      <w:r>
-        <w:rPr>
-          <w:b/>
-        </w:rPr>
-        <w:t>Milestone 1 Research</w:t>
-      </w:r>
-    </w:p>
-    <w:p/>
-    <w:p>
-      <w:r>
-        <w:t xml:space="preserve">Find and List 3+ inventory applications on the market: do a simple internet search </w:t>
-      </w:r>
-    </w:p>
-    <w:p>
-      <w:pPr>
-        <w:rPr>
-          <w:i/>
-          <w:color w:val="666666"/>
-        </w:rPr>
-      </w:pPr>
-      <w:r>
-        <w:rPr>
-          <w:i/>
-          <w:color w:val="666666"/>
-        </w:rPr>
-        <w:t>[inventory application 1]</w:t>
-      </w:r>
-    </w:p>
-    <w:p>
-      <w:pPr>
-        <w:rPr>
-          <w:i/>
-          <w:color w:val="666666"/>
-        </w:rPr>
-      </w:pPr>
-      <w:r>
-        <w:rPr>
-          <w:i/>
-          <w:color w:val="666666"/>
-        </w:rPr>
-        <w:t>[inventory application 2]</w:t>
-      </w:r>
-    </w:p>
-    <w:p>
-      <w:pPr>
-        <w:rPr>
-          <w:i/>
-          <w:color w:val="666666"/>
-        </w:rPr>
-      </w:pPr>
-      <w:r>
-        <w:rPr>
-          <w:i/>
-          <w:color w:val="666666"/>
-        </w:rPr>
-        <w:t>[inventory application 3]</w:t>
-      </w:r>
-    </w:p>
-    <w:p/>
-    <w:p>
-      <w:r>
-        <w:t xml:space="preserve">List 5 features of the inventory application </w:t>
-      </w:r>
-    </w:p>
-    <w:p>
-      <w:pPr>
-        <w:rPr>
-          <w:i/>
-          <w:color w:val="666666"/>
-        </w:rPr>
-      </w:pPr>
-      <w:r>
-        <w:rPr>
-          <w:i/>
-          <w:color w:val="666666"/>
-        </w:rPr>
-        <w:t>[inventory feature 1]</w:t>
-      </w:r>
-    </w:p>
-    <w:p>
-      <w:pPr>
-        <w:rPr>
-          <w:i/>
-          <w:color w:val="666666"/>
-        </w:rPr>
-      </w:pPr>
-      <w:r>
-        <w:rPr>
-          <w:i/>
-          <w:color w:val="666666"/>
-        </w:rPr>
-        <w:t>[inventory feature 2]</w:t>
-      </w:r>
-    </w:p>
-    <w:p>
-      <w:pPr>
-        <w:rPr>
-          <w:i/>
-          <w:color w:val="666666"/>
-        </w:rPr>
-      </w:pPr>
-      <w:r>
-        <w:rPr>
-          <w:i/>
-          <w:color w:val="666666"/>
-        </w:rPr>
-        <w:t>[inventory feature 3]</w:t>
-      </w:r>
-    </w:p>
-    <w:p/>
-    <w:p>
-      <w:r>
-        <w:t xml:space="preserve">What is inventory? </w:t>
-      </w:r>
-    </w:p>
-    <w:p>
-      <w:pPr>
-        <w:rPr>
-          <w:i/>
-          <w:iCs/>
-          <w:color w:val="666666"/>
-          <w:lang w:val="en-US"/>
-        </w:rPr>
-      </w:pPr>
-      <w:r>
-        <w:rPr>
-          <w:i/>
-          <w:iCs/>
-          <w:color w:val="666666"/>
-          <w:lang w:val="en-US"/>
-        </w:rPr>
-        <w:t xml:space="preserve">Lorem ipsum dolor sit amet, consectetur adipiscing elit, sed do eiusmod tempor incididunt ut labore et dolore magna aliqua. </w:t>
-      </w:r>
-      <w:r>
-        <w:rPr>
-          <w:i/>
-          <w:iCs/>
-          <w:color w:val="666666"/>
-          <w:lang w:val="pt-BR"/>
-        </w:rPr>
-        <w:t xml:space="preserve">Ut enim ad minim veniam, quis nostrud exercitation ullamco laboris nisi ut aliquip ex ea commodo consequat. </w:t>
-      </w:r>
-      <w:r>
-        <w:rPr>
-          <w:i/>
-          <w:iCs/>
-          <w:color w:val="666666"/>
-          <w:lang w:val="en-US"/>
-        </w:rPr>
-        <w:t>Duis aute irure dolor in reprehenderit in voluptate velit esse cillum dolore eu fugiat nulla pariatur. Excepteur sint occaecat cupidatat non proident, sunt in culpa qui officia deserunt mollit anim id est laborum.</w:t>
-      </w:r>
-    </w:p>
-    <w:p/>
-    <w:p>
-      <w:r>
-        <w:t xml:space="preserve">How is it useful? </w:t>
-      </w:r>
-    </w:p>
-    <w:p>
-      <w:pPr>
-        <w:rPr>
-          <w:i/>
-          <w:iCs/>
-          <w:color w:val="666666"/>
-          <w:lang w:val="en-US"/>
-        </w:rPr>
-      </w:pPr>
-      <w:r>
-        <w:rPr>
-          <w:i/>
-          <w:iCs/>
-          <w:color w:val="666666"/>
-          <w:lang w:val="en-US"/>
-        </w:rPr>
-        <w:t xml:space="preserve">Lorem ipsum dolor sit amet, consectetur adipiscing elit, sed do eiusmod tempor incididunt ut labore et dolore magna aliqua. </w:t>
-      </w:r>
-      <w:r>
-        <w:rPr>
-          <w:i/>
-          <w:iCs/>
-          <w:color w:val="666666"/>
-          <w:lang w:val="pt-BR"/>
-        </w:rPr>
-        <w:t xml:space="preserve">Ut enim ad minim veniam, quis nostrud exercitation ullamco laboris nisi ut aliquip ex ea commodo consequat. </w:t>
-      </w:r>
-      <w:r>
-        <w:rPr>
-          <w:i/>
-          <w:iCs/>
-          <w:color w:val="666666"/>
-          <w:lang w:val="en-US"/>
-        </w:rPr>
-        <w:t>Duis aute irure dolor in reprehenderit in voluptate velit esse cillum dolore eu fugiat nulla pariatur. Excepteur sint occaecat cupidatat non proident, sunt in culpa qui officia deserunt mollit anim id est laborum.</w:t>
-      </w:r>
-    </w:p>
-    <w:p>
-      <w:pPr>
-        <w:rPr>
-          <w:i/>
-          <w:color w:val="666666"/>
-        </w:rPr>
-      </w:pPr>
-      <w:r>
-        <w:rPr>
-          <w:i/>
-          <w:color w:val="666666"/>
-        </w:rPr>
-        <w:t xml:space="preserve">list example information that can be stored in inventory </w:t>
-      </w:r>
-    </w:p>
-    <w:p/>
-    <w:p>
-      <w:r>
-        <w:rPr>
-          <w:lang w:val="en-US"/>
-        </w:rPr>
-        <w:t>What is the most important information stored in inventory? Why?</w:t>
-      </w:r>
-    </w:p>
-    <w:p>
-      <w:pPr>
-        <w:rPr>
-          <w:i/>
-          <w:iCs/>
-          <w:color w:val="666666"/>
-          <w:lang w:val="en-US"/>
-        </w:rPr>
-      </w:pPr>
-      <w:r>
-        <w:rPr>
-          <w:i/>
-          <w:iCs/>
-          <w:color w:val="666666"/>
-          <w:lang w:val="en-US"/>
-        </w:rPr>
-        <w:t>[Lorem ipsum dolor sit amet, consectetur adipiscing elit, sed do eiusmod tempor incididunt ut labore et dolore magna aliqua.]</w:t>
-      </w:r>
-    </w:p>
-    <w:p/>
-    <w:p>
-      <w:pPr>
-        <w:rPr>
-          <w:b/>
-        </w:rPr>
-      </w:pPr>
-      <w:r>
-        <w:rPr>
-          <w:b/>
-        </w:rPr>
-        <w:t xml:space="preserve">Bug Report </w:t>
-      </w:r>
-    </w:p>
-    <w:p>
-      <w:r>
-        <w:t>None</w:t>
-      </w:r>
-    </w:p>
-    <w:p/>
-    <w:p>
-      <w:pPr>
-        <w:rPr>
-          <w:b/>
-        </w:rPr>
-      </w:pPr>
-      <w:r>
-        <w:rPr>
-          <w:b/>
-        </w:rPr>
-        <w:t>Follow up Questions</w:t>
-      </w:r>
-    </w:p>
-    <w:p>
-      <w:pPr>
-        <w:numPr>
-          <w:ilvl w:val="0"/>
-          <w:numId w:val="1"/>
-        </w:numPr>
-        <w:shd w:val="clear" w:color="auto" w:fill="FFFFFF" w:themeFill="background1"/>
-      </w:pPr>
-      <w:r>
-        <w:rPr>
-          <w:rFonts w:ascii="Open Sans" w:eastAsia="Open Sans" w:hAnsi="Open Sans" w:cs="Open Sans"/>
-          <w:color w:val="616161"/>
-          <w:lang w:val="en-US"/>
-        </w:rPr>
-        <w:t>What was challenging?</w:t>
-      </w:r>
-    </w:p>
-    <w:p>
-      <w:pPr>
-        <w:numPr>
-          <w:ilvl w:val="0"/>
-          <w:numId w:val="1"/>
-        </w:numPr>
-        <w:shd w:val="clear" w:color="auto" w:fill="FFFFFF"/>
-      </w:pPr>
-      <w:r>
-        <w:rPr>
-          <w:rFonts w:ascii="Open Sans" w:eastAsia="Open Sans" w:hAnsi="Open Sans" w:cs="Open Sans"/>
-          <w:color w:val="616161"/>
-        </w:rPr>
-        <w:t>What did you learn?</w:t>
-      </w:r>
-    </w:p>
-    <w:p>
-      <w:pPr>
-        <w:numPr>
-          <w:ilvl w:val="0"/>
-          <w:numId w:val="1"/>
-        </w:numPr>
-        <w:shd w:val="clear" w:color="auto" w:fill="FFFFFF"/>
-      </w:pPr>
-      <w:r>
-        <w:rPr>
-          <w:rFonts w:ascii="Open Sans" w:eastAsia="Open Sans" w:hAnsi="Open Sans" w:cs="Open Sans"/>
-          <w:color w:val="616161"/>
-        </w:rPr>
-        <w:t>How would you improve on the project?</w:t>
-      </w:r>
-    </w:p>
-    <w:p>
-      <w:pPr>
-        <w:numPr>
-          <w:ilvl w:val="0"/>
-          <w:numId w:val="1"/>
-        </w:numPr>
-        <w:shd w:val="clear" w:color="auto" w:fill="FFFFFF"/>
-        <w:spacing w:after="120"/>
-      </w:pPr>
-      <w:r>
-        <w:rPr>
-          <w:rFonts w:ascii="Open Sans" w:eastAsia="Open Sans" w:hAnsi="Open Sans" w:cs="Open Sans"/>
-          <w:color w:val="616161"/>
-        </w:rPr>
-        <w:t>How can you use what you learned on the job?</w:t>
-      </w:r>
-    </w:p>
-    <w:p/>
-    <w:p/>
-    <w:p/>
-    <w:p/>
+      </w:pPr>
+    </w:p>
+    <w:p>
+      <w:r>
+        <w:t xml:space="preserve">This week we learned recursion and how to use it in practical applications. Minesweeper is just one instance of such an occasion using recursion flood fill to fill all the empty </w:t>
+      </w:r>
+      <w:r>
+        <w:t>space</w:t>
+      </w:r>
+      <w:r>
+        <w:t xml:space="preserve"> on the map is an </w:t>
+      </w:r>
+      <w:r>
+        <w:t>excellent</w:t>
+      </w:r>
+      <w:r>
+        <w:t xml:space="preserve"> demonstration of a typical use case</w:t>
+      </w:r>
+      <w:r>
+        <w:t>. Other cases involve image editing applications and terrain manipulation algorithms where 3D voids are space might be present. Recursion is a rather elegant way to handle many complex problems by breaking them down into smaller more manageable chunks.</w:t>
+      </w:r>
+    </w:p>
     <w:sectPr>
       <w:pgSz w:w="12240" w:h="15840"/>
       <w:pgMar w:top="1440" w:right="1440" w:bottom="1440" w:left="1440" w:header="720" w:footer="720" w:gutter="0"/>
@@ -2189,6 +1483,29 @@
       <w:szCs w:val="30"/>
     </w:rPr>
   </w:style>
+  <w:style w:type="character" w:styleId="Hyperlink">
+    <w:name w:val="Hyperlink"/>
+    <w:basedOn w:val="DefaultParagraphFont"/>
+    <w:uiPriority w:val="99"/>
+    <w:unhideWhenUsed/>
+    <w:rsid w:val="002D4AF5"/>
+    <w:rPr>
+      <w:color w:val="0000FF" w:themeColor="hyperlink"/>
+      <w:u w:val="single"/>
+    </w:rPr>
+  </w:style>
+  <w:style w:type="character" w:styleId="UnresolvedMention">
+    <w:name w:val="Unresolved Mention"/>
+    <w:basedOn w:val="DefaultParagraphFont"/>
+    <w:uiPriority w:val="99"/>
+    <w:semiHidden/>
+    <w:unhideWhenUsed/>
+    <w:rsid w:val="002D4AF5"/>
+    <w:rPr>
+      <w:color w:val="605E5C"/>
+      <w:shd w:val="clear" w:color="auto" w:fill="E1DFDD"/>
+    </w:rPr>
+  </w:style>
 </w:styles>
 </file>
 

</xml_diff>